<commit_message>
mtn les message s'affiche en temps reel sans refresh
</commit_message>
<xml_diff>
--- a/Rapport_Technique_SwapTN.docx
+++ b/Rapport_Technique_SwapTN.docx
@@ -203,8 +203,6 @@
             <w:r>
               <w:t>GLSI 2</w:t>
             </w:r>
-            <w:bookmarkStart w:id="0" w:name="_GoBack"/>
-            <w:bookmarkEnd w:id="0"/>
           </w:p>
         </w:tc>
       </w:tr>
@@ -442,38 +440,46 @@
       <w:pPr>
         <w:pStyle w:val="Titre2"/>
       </w:pPr>
+      <w:proofErr w:type="spellStart"/>
       <w:r>
-        <w:t>Prérequis:</w:t>
+        <w:t>Prérequis</w:t>
+      </w:r>
+      <w:proofErr w:type="spellEnd"/>
+      <w:r>
+        <w:t>:</w:t>
       </w:r>
     </w:p>
     <w:tbl>
       <w:tblPr>
         <w:tblStyle w:val="Grilleclaire-Accent1"/>
-        <w:tblW w:w="0" w:type="auto"/>
+        <w:tblW w:w="8868" w:type="dxa"/>
         <w:tblLook w:val="04A0" w:firstRow="1" w:lastRow="0" w:firstColumn="1" w:lastColumn="0" w:noHBand="0" w:noVBand="1"/>
       </w:tblPr>
       <w:tblGrid>
-        <w:gridCol w:w="4320"/>
-        <w:gridCol w:w="4320"/>
+        <w:gridCol w:w="4434"/>
+        <w:gridCol w:w="4434"/>
       </w:tblGrid>
       <w:tr>
         <w:trPr>
           <w:cnfStyle w:val="100000000000" w:firstRow="1" w:lastRow="0" w:firstColumn="0" w:lastColumn="0" w:oddVBand="0" w:evenVBand="0" w:oddHBand="0" w:evenHBand="0" w:firstRowFirstColumn="0" w:firstRowLastColumn="0" w:lastRowFirstColumn="0" w:lastRowLastColumn="0"/>
+          <w:trHeight w:val="232"/>
         </w:trPr>
         <w:tc>
           <w:tcPr>
             <w:cnfStyle w:val="001000000000" w:firstRow="0" w:lastRow="0" w:firstColumn="1" w:lastColumn="0" w:oddVBand="0" w:evenVBand="0" w:oddHBand="0" w:evenHBand="0" w:firstRowFirstColumn="0" w:firstRowLastColumn="0" w:lastRowFirstColumn="0" w:lastRowLastColumn="0"/>
-            <w:tcW w:w="4320" w:type="dxa"/>
+            <w:tcW w:w="4434" w:type="dxa"/>
           </w:tcPr>
           <w:p>
+            <w:proofErr w:type="spellStart"/>
             <w:r>
               <w:t>Outil</w:t>
             </w:r>
+            <w:proofErr w:type="spellEnd"/>
           </w:p>
         </w:tc>
         <w:tc>
           <w:tcPr>
-            <w:tcW w:w="4320" w:type="dxa"/>
+            <w:tcW w:w="4434" w:type="dxa"/>
           </w:tcPr>
           <w:p>
             <w:pPr>
@@ -488,11 +494,12 @@
       <w:tr>
         <w:trPr>
           <w:cnfStyle w:val="000000100000" w:firstRow="0" w:lastRow="0" w:firstColumn="0" w:lastColumn="0" w:oddVBand="0" w:evenVBand="0" w:oddHBand="1" w:evenHBand="0" w:firstRowFirstColumn="0" w:firstRowLastColumn="0" w:lastRowFirstColumn="0" w:lastRowLastColumn="0"/>
+          <w:trHeight w:val="242"/>
         </w:trPr>
         <w:tc>
           <w:tcPr>
             <w:cnfStyle w:val="001000000000" w:firstRow="0" w:lastRow="0" w:firstColumn="1" w:lastColumn="0" w:oddVBand="0" w:evenVBand="0" w:oddHBand="0" w:evenHBand="0" w:firstRowFirstColumn="0" w:firstRowLastColumn="0" w:lastRowFirstColumn="0" w:lastRowLastColumn="0"/>
-            <w:tcW w:w="4320" w:type="dxa"/>
+            <w:tcW w:w="4434" w:type="dxa"/>
           </w:tcPr>
           <w:p>
             <w:r>
@@ -502,7 +509,7 @@
         </w:tc>
         <w:tc>
           <w:tcPr>
-            <w:tcW w:w="4320" w:type="dxa"/>
+            <w:tcW w:w="4434" w:type="dxa"/>
           </w:tcPr>
           <w:p>
             <w:pPr>
@@ -517,11 +524,12 @@
       <w:tr>
         <w:trPr>
           <w:cnfStyle w:val="000000010000" w:firstRow="0" w:lastRow="0" w:firstColumn="0" w:lastColumn="0" w:oddVBand="0" w:evenVBand="0" w:oddHBand="0" w:evenHBand="1" w:firstRowFirstColumn="0" w:firstRowLastColumn="0" w:lastRowFirstColumn="0" w:lastRowLastColumn="0"/>
+          <w:trHeight w:val="242"/>
         </w:trPr>
         <w:tc>
           <w:tcPr>
             <w:cnfStyle w:val="001000000000" w:firstRow="0" w:lastRow="0" w:firstColumn="1" w:lastColumn="0" w:oddVBand="0" w:evenVBand="0" w:oddHBand="0" w:evenHBand="0" w:firstRowFirstColumn="0" w:firstRowLastColumn="0" w:lastRowFirstColumn="0" w:lastRowLastColumn="0"/>
-            <w:tcW w:w="4320" w:type="dxa"/>
+            <w:tcW w:w="4434" w:type="dxa"/>
           </w:tcPr>
           <w:p>
             <w:r>
@@ -531,7 +539,7 @@
         </w:tc>
         <w:tc>
           <w:tcPr>
-            <w:tcW w:w="4320" w:type="dxa"/>
+            <w:tcW w:w="4434" w:type="dxa"/>
           </w:tcPr>
           <w:p>
             <w:pPr>
@@ -546,11 +554,12 @@
       <w:tr>
         <w:trPr>
           <w:cnfStyle w:val="000000100000" w:firstRow="0" w:lastRow="0" w:firstColumn="0" w:lastColumn="0" w:oddVBand="0" w:evenVBand="0" w:oddHBand="1" w:evenHBand="0" w:firstRowFirstColumn="0" w:firstRowLastColumn="0" w:lastRowFirstColumn="0" w:lastRowLastColumn="0"/>
+          <w:trHeight w:val="232"/>
         </w:trPr>
         <w:tc>
           <w:tcPr>
             <w:cnfStyle w:val="001000000000" w:firstRow="0" w:lastRow="0" w:firstColumn="1" w:lastColumn="0" w:oddVBand="0" w:evenVBand="0" w:oddHBand="0" w:evenHBand="0" w:firstRowFirstColumn="0" w:firstRowLastColumn="0" w:lastRowFirstColumn="0" w:lastRowLastColumn="0"/>
-            <w:tcW w:w="4320" w:type="dxa"/>
+            <w:tcW w:w="4434" w:type="dxa"/>
           </w:tcPr>
           <w:p>
             <w:r>
@@ -560,7 +569,7 @@
         </w:tc>
         <w:tc>
           <w:tcPr>
-            <w:tcW w:w="4320" w:type="dxa"/>
+            <w:tcW w:w="4434" w:type="dxa"/>
           </w:tcPr>
           <w:p>
             <w:pPr>
@@ -575,11 +584,12 @@
       <w:tr>
         <w:trPr>
           <w:cnfStyle w:val="000000010000" w:firstRow="0" w:lastRow="0" w:firstColumn="0" w:lastColumn="0" w:oddVBand="0" w:evenVBand="0" w:oddHBand="0" w:evenHBand="1" w:firstRowFirstColumn="0" w:firstRowLastColumn="0" w:lastRowFirstColumn="0" w:lastRowLastColumn="0"/>
+          <w:trHeight w:val="242"/>
         </w:trPr>
         <w:tc>
           <w:tcPr>
             <w:cnfStyle w:val="001000000000" w:firstRow="0" w:lastRow="0" w:firstColumn="1" w:lastColumn="0" w:oddVBand="0" w:evenVBand="0" w:oddHBand="0" w:evenHBand="0" w:firstRowFirstColumn="0" w:firstRowLastColumn="0" w:lastRowFirstColumn="0" w:lastRowLastColumn="0"/>
-            <w:tcW w:w="4320" w:type="dxa"/>
+            <w:tcW w:w="4434" w:type="dxa"/>
           </w:tcPr>
           <w:p>
             <w:r>
@@ -589,7 +599,7 @@
         </w:tc>
         <w:tc>
           <w:tcPr>
-            <w:tcW w:w="4320" w:type="dxa"/>
+            <w:tcW w:w="4434" w:type="dxa"/>
           </w:tcPr>
           <w:p>
             <w:pPr>
@@ -617,11 +627,12 @@
       <w:tr>
         <w:trPr>
           <w:cnfStyle w:val="000000100000" w:firstRow="0" w:lastRow="0" w:firstColumn="0" w:lastColumn="0" w:oddVBand="0" w:evenVBand="0" w:oddHBand="1" w:evenHBand="0" w:firstRowFirstColumn="0" w:firstRowLastColumn="0" w:lastRowFirstColumn="0" w:lastRowLastColumn="0"/>
+          <w:trHeight w:val="232"/>
         </w:trPr>
         <w:tc>
           <w:tcPr>
             <w:cnfStyle w:val="001000000000" w:firstRow="0" w:lastRow="0" w:firstColumn="1" w:lastColumn="0" w:oddVBand="0" w:evenVBand="0" w:oddHBand="0" w:evenHBand="0" w:firstRowFirstColumn="0" w:firstRowLastColumn="0" w:lastRowFirstColumn="0" w:lastRowLastColumn="0"/>
-            <w:tcW w:w="4320" w:type="dxa"/>
+            <w:tcW w:w="4434" w:type="dxa"/>
           </w:tcPr>
           <w:p>
             <w:r>
@@ -631,7 +642,7 @@
         </w:tc>
         <w:tc>
           <w:tcPr>
-            <w:tcW w:w="4320" w:type="dxa"/>
+            <w:tcW w:w="4434" w:type="dxa"/>
           </w:tcPr>
           <w:p>
             <w:pPr>
@@ -664,9 +675,22 @@
       <w:pPr>
         <w:pStyle w:val="Titre2"/>
       </w:pPr>
+      <w:proofErr w:type="spellStart"/>
       <w:r>
         <w:lastRenderedPageBreak/>
-        <w:t>Dépendances principales:</w:t>
+        <w:t>Dépendances</w:t>
+      </w:r>
+      <w:proofErr w:type="spellEnd"/>
+      <w:r>
+        <w:t xml:space="preserve"> </w:t>
+      </w:r>
+      <w:proofErr w:type="spellStart"/>
+      <w:r>
+        <w:t>principales</w:t>
+      </w:r>
+      <w:proofErr w:type="spellEnd"/>
+      <w:r>
+        <w:t>:</w:t>
       </w:r>
     </w:p>
     <w:p>
@@ -1386,6 +1410,45 @@
         <w:t>admins</w:t>
       </w:r>
       <w:proofErr w:type="spellEnd"/>
+    </w:p>
+    <w:p>
+      <w:pPr>
+        <w:rPr>
+          <w:color w:val="FF0000"/>
+          <w:lang w:val="fr-FR"/>
+        </w:rPr>
+      </w:pPr>
+      <w:r>
+        <w:rPr>
+          <w:color w:val="FF0000"/>
+          <w:lang w:val="fr-FR"/>
+        </w:rPr>
+        <w:t>Email :</w:t>
+      </w:r>
+      <w:r>
+        <w:rPr>
+          <w:color w:val="FF0000"/>
+          <w:lang w:val="fr-FR"/>
+        </w:rPr>
+        <w:t xml:space="preserve"> admin@gmail.com</w:t>
+      </w:r>
+    </w:p>
+    <w:p>
+      <w:pPr>
+        <w:rPr>
+          <w:color w:val="FF0000"/>
+          <w:lang w:val="fr-FR"/>
+        </w:rPr>
+      </w:pPr>
+      <w:r>
+        <w:rPr>
+          <w:color w:val="FF0000"/>
+          <w:lang w:val="fr-FR"/>
+        </w:rPr>
+        <w:t>Mot de passe : 123456789</w:t>
+      </w:r>
+      <w:bookmarkStart w:id="0" w:name="_GoBack"/>
+      <w:bookmarkEnd w:id="0"/>
     </w:p>
     <w:p>
       <w:pPr>
@@ -14592,7 +14655,7 @@
 </file>
 
 <file path=customXml/itemProps1.xml><?xml version="1.0" encoding="utf-8"?>
-<ds:datastoreItem xmlns:ds="http://schemas.openxmlformats.org/officeDocument/2006/customXml" ds:itemID="{0ECBE5DA-3D9E-4ED8-82FA-7DE2839342FC}">
+<ds:datastoreItem xmlns:ds="http://schemas.openxmlformats.org/officeDocument/2006/customXml" ds:itemID="{F155D485-C464-4558-8407-9FD5C3EDED61}">
   <ds:schemaRefs>
     <ds:schemaRef ds:uri="http://schemas.openxmlformats.org/officeDocument/2006/bibliography"/>
   </ds:schemaRefs>

</xml_diff>